<commit_message>
Đề xuất MKT Sun: đổi tiêu đề trang sang TATILAND
Co-Authored-By: Claude Opus 5.5 <noreply@anthropic.com>
Claude-Session: https://claude.ai/code/session_01Wm6ymfQmWN1NSYvrCHLiNa
</commit_message>
<xml_diff>
--- a/bao-cao-marketing/DeXuat_MKT_DoiUng_Thang11-12_Sun_COLLECTION.docx
+++ b/bao-cao-marketing/DeXuat_MKT_DoiUng_Thang11-12_Sun_COLLECTION.docx
@@ -4930,74 +4930,39 @@
               <w:noProof/>
             </w:rPr>
             <w:drawing>
-              <wp:anchor distT="0" distB="0" distL="114300" distR="114300" simplePos="0" relativeHeight="251658240" behindDoc="1" locked="0" layoutInCell="1" allowOverlap="1" wp14:anchorId="1DED0C3F" wp14:editId="736C1BB5">
-                <wp:simplePos x="0" y="0"/>
-                <wp:positionH relativeFrom="column">
-                  <wp:posOffset>-73025</wp:posOffset>
-                </wp:positionH>
-                <wp:positionV relativeFrom="paragraph">
-                  <wp:posOffset>2540</wp:posOffset>
-                </wp:positionV>
-                <wp:extent cx="1158240" cy="288925"/>
-                <wp:effectExtent l="0" t="0" r="3810" b="0"/>
-                <wp:wrapTight wrapText="bothSides">
-                  <wp:wrapPolygon edited="0">
-                    <wp:start x="0" y="1424"/>
-                    <wp:lineTo x="355" y="18514"/>
-                    <wp:lineTo x="20961" y="18514"/>
-                    <wp:lineTo x="21316" y="1424"/>
-                    <wp:lineTo x="0" y="1424"/>
-                  </wp:wrapPolygon>
-                </wp:wrapTight>
-                <wp:docPr id="1835280679" name="Picture 4"/>
-                <wp:cNvGraphicFramePr>
-                  <a:graphicFrameLocks xmlns:a="http://schemas.openxmlformats.org/drawingml/2006/main" noChangeAspect="1"/>
-                </wp:cNvGraphicFramePr>
+              <wp:inline distT="0" distB="0" distL="0" distR="0">
+                <wp:extent cx="1188720" cy="590261"/>
+                <wp:effectExtent l="0" t="0" r="0" b="0"/>
+                <wp:docPr id="3" name="image1.png"/>
+                <wp:cNvGraphicFramePr/>
                 <a:graphic xmlns:a="http://schemas.openxmlformats.org/drawingml/2006/main">
                   <a:graphicData uri="http://schemas.openxmlformats.org/drawingml/2006/picture">
                     <pic:pic xmlns:pic="http://schemas.openxmlformats.org/drawingml/2006/picture">
                       <pic:nvPicPr>
-                        <pic:cNvPr id="0" name="Picture 2"/>
-                        <pic:cNvPicPr>
-                          <a:picLocks noChangeAspect="1" noChangeArrowheads="1"/>
-                        </pic:cNvPicPr>
+                        <pic:cNvPr id="0" name="image1.png"/>
+                        <pic:cNvPicPr preferRelativeResize="0"/>
                       </pic:nvPicPr>
                       <pic:blipFill>
-                        <a:blip r:embed="rId1">
-                          <a:extLst>
-                            <a:ext uri="{28A0092B-C50C-407E-A947-70E740481C1C}">
-                              <a14:useLocalDpi xmlns:a14="http://schemas.microsoft.com/office/drawing/2010/main" val="0"/>
-                            </a:ext>
-                          </a:extLst>
-                        </a:blip>
+                        <a:blip r:embed="rId1"/>
                         <a:srcRect/>
                         <a:stretch>
                           <a:fillRect/>
                         </a:stretch>
                       </pic:blipFill>
-                      <pic:spPr bwMode="auto">
+                      <pic:spPr>
                         <a:xfrm>
                           <a:off x="0" y="0"/>
-                          <a:ext cx="1158240" cy="288925"/>
+                          <a:ext cx="1188720" cy="590261"/>
                         </a:xfrm>
                         <a:prstGeom prst="rect">
                           <a:avLst/>
                         </a:prstGeom>
-                        <a:noFill/>
-                        <a:ln>
-                          <a:noFill/>
-                        </a:ln>
+                        <a:ln/>
                       </pic:spPr>
                     </pic:pic>
                   </a:graphicData>
                 </a:graphic>
-                <wp14:sizeRelH relativeFrom="margin">
-                  <wp14:pctWidth>0</wp14:pctWidth>
-                </wp14:sizeRelH>
-                <wp14:sizeRelV relativeFrom="margin">
-                  <wp14:pctHeight>0</wp14:pctHeight>
-                </wp14:sizeRelV>
-              </wp:anchor>
+              </wp:inline>
             </w:drawing>
           </w:r>
         </w:p>
@@ -5015,21 +4980,150 @@
               <w:b/>
               <w:bCs/>
               <w:color w:val="0B4F3A"/>
-              <w:sz w:val="20"/>
-              <w:szCs w:val="20"/>
+              <w:sz w:val="24"/>
+              <w:szCs w:val="24"/>
             </w:rPr>
-            <w:t>CÔNG TY CỔ PHẦN</w:t>
+            <w:t>CÔNG TY CỔ PHẦN ĐẦU TƯ ĐỊA ỐC TATI</w:t>
           </w:r>
           <w:r>
+            <w:br/>
+          </w:r>
+          <w:proofErr w:type="spellStart"/>
+          <w:r>
             <w:rPr>
-              <w:b/>
-              <w:bCs/>
-              <w:color w:val="0B4F3A"/>
-              <w:sz w:val="20"/>
-              <w:szCs w:val="20"/>
+              <w:color w:val="1F1F1F"/>
+              <w:sz w:val="17"/>
+              <w:szCs w:val="17"/>
             </w:rPr>
-            <w:t xml:space="preserve"> SÀN GIAO DỊCH BẤT ĐỘNG SẢN TATI INVEST</w:t>
+            <w:t>Địa</w:t>
           </w:r>
+          <w:proofErr w:type="spellEnd"/>
+          <w:r>
+            <w:rPr>
+              <w:color w:val="1F1F1F"/>
+              <w:sz w:val="17"/>
+              <w:szCs w:val="17"/>
+            </w:rPr>
+            <w:t xml:space="preserve"> </w:t>
+          </w:r>
+          <w:proofErr w:type="spellStart"/>
+          <w:r>
+            <w:rPr>
+              <w:color w:val="1F1F1F"/>
+              <w:sz w:val="17"/>
+              <w:szCs w:val="17"/>
+            </w:rPr>
+            <w:t>chỉ</w:t>
+          </w:r>
+          <w:proofErr w:type="spellEnd"/>
+          <w:r>
+            <w:rPr>
+              <w:color w:val="1F1F1F"/>
+              <w:sz w:val="17"/>
+              <w:szCs w:val="17"/>
+            </w:rPr>
+            <w:t xml:space="preserve">: 23-25 Nguyễn </w:t>
+          </w:r>
+          <w:proofErr w:type="spellStart"/>
+          <w:r>
+            <w:rPr>
+              <w:color w:val="1F1F1F"/>
+              <w:sz w:val="17"/>
+              <w:szCs w:val="17"/>
+            </w:rPr>
+            <w:t>Phước</w:t>
+          </w:r>
+          <w:proofErr w:type="spellEnd"/>
+          <w:r>
+            <w:rPr>
+              <w:color w:val="1F1F1F"/>
+              <w:sz w:val="17"/>
+              <w:szCs w:val="17"/>
+            </w:rPr>
+            <w:t xml:space="preserve"> Lan, </w:t>
+          </w:r>
+          <w:proofErr w:type="spellStart"/>
+          <w:r>
+            <w:rPr>
+              <w:color w:val="1F1F1F"/>
+              <w:sz w:val="17"/>
+              <w:szCs w:val="17"/>
+            </w:rPr>
+            <w:t>Hòa</w:t>
+          </w:r>
+          <w:proofErr w:type="spellEnd"/>
+          <w:r>
+            <w:rPr>
+              <w:color w:val="1F1F1F"/>
+              <w:sz w:val="17"/>
+              <w:szCs w:val="17"/>
+            </w:rPr>
+            <w:t xml:space="preserve"> Xuân, </w:t>
+          </w:r>
+          <w:proofErr w:type="spellStart"/>
+          <w:r>
+            <w:rPr>
+              <w:color w:val="1F1F1F"/>
+              <w:sz w:val="17"/>
+              <w:szCs w:val="17"/>
+            </w:rPr>
+            <w:t>Cẩm</w:t>
+          </w:r>
+          <w:proofErr w:type="spellEnd"/>
+          <w:r>
+            <w:rPr>
+              <w:color w:val="1F1F1F"/>
+              <w:sz w:val="17"/>
+              <w:szCs w:val="17"/>
+            </w:rPr>
+            <w:t xml:space="preserve"> </w:t>
+          </w:r>
+          <w:proofErr w:type="spellStart"/>
+          <w:r>
+            <w:rPr>
+              <w:color w:val="1F1F1F"/>
+              <w:sz w:val="17"/>
+              <w:szCs w:val="17"/>
+            </w:rPr>
+            <w:t>Lệ</w:t>
+          </w:r>
+          <w:proofErr w:type="spellEnd"/>
+          <w:r>
+            <w:rPr>
+              <w:color w:val="1F1F1F"/>
+              <w:sz w:val="17"/>
+              <w:szCs w:val="17"/>
+            </w:rPr>
+            <w:t xml:space="preserve">, </w:t>
+          </w:r>
+          <w:proofErr w:type="spellStart"/>
+          <w:r>
+            <w:rPr>
+              <w:color w:val="1F1F1F"/>
+              <w:sz w:val="17"/>
+              <w:szCs w:val="17"/>
+            </w:rPr>
+            <w:t>Đà</w:t>
+          </w:r>
+          <w:proofErr w:type="spellEnd"/>
+          <w:r>
+            <w:rPr>
+              <w:color w:val="1F1F1F"/>
+              <w:sz w:val="17"/>
+              <w:szCs w:val="17"/>
+            </w:rPr>
+            <w:t xml:space="preserve"> </w:t>
+          </w:r>
+          <w:proofErr w:type="spellStart"/>
+          <w:r>
+            <w:rPr>
+              <w:color w:val="1F1F1F"/>
+              <w:sz w:val="17"/>
+              <w:szCs w:val="17"/>
+            </w:rPr>
+            <w:t>Nẵng</w:t>
+          </w:r>
+          <w:proofErr w:type="spellEnd"/>
           <w:r>
             <w:br/>
           </w:r>
@@ -5039,15 +5133,10 @@
               <w:sz w:val="17"/>
               <w:szCs w:val="17"/>
             </w:rPr>
-            <w:t xml:space="preserve">Địa chỉ: </w:t>
+            <w:t>Website: www.tatiland.vn</w:t>
           </w:r>
           <w:r>
-            <w:rPr>
-              <w:color w:val="1F1F1F"/>
-              <w:sz w:val="17"/>
-              <w:szCs w:val="17"/>
-            </w:rPr>
-            <w:t>Tầng 4 số 23-25 Nguyễn Phước Lan, Phường Hoà Xuân, TP Đà Nẵng</w:t>
+            <w:br/>
           </w:r>
         </w:p>
       </w:tc>

</xml_diff>